<commit_message>
feat: add Lab direct controls + AI live tweaking (lightweight WebAudio preview + server STFT DSP)
- server/ml/lab_dsp.py: lightweight EQ/filter/pitch/speed/gain/reverb via librosa STFT, suggest preset from mood/genre (no heavy models)
- server/routes/lab.py: POST /api/lab/tweak and /api/lab/suggest, wired in server/main.py
- website/src/app/lab/page.tsx: dual-mode Lab — 5-band EQ, HP/LP, gain/pitch/speed/reverb, instant WebAudio Biquad preview + spectrum, AI animates knobs for audience view, export on demand
- website/src/components/Nav.tsx + website/src/app/page.tsx: add Lab navigation
- also include pending feature/report updates
</commit_message>
<xml_diff>
--- a/docs/IEEE_Report_Audio_Editing_updated.docx
+++ b/docs/IEEE_Report_Audio_Editing_updated.docx
@@ -1234,7 +1234,7 @@
       <w:r>
         <w:drawing>
           <wp:inline>
-            <wp:extent cx="5334000" cy="1837764"/>
+            <wp:extent cx="5334000" cy="3361210"/>
             <wp:effectExtent b="0" l="0" r="0" t="0"/>
             <wp:docPr descr="" title="" id="10" name="Picture"/>
             <a:graphic>
@@ -1255,7 +1255,7 @@
                   <pic:spPr bwMode="auto">
                     <a:xfrm>
                       <a:off x="0" y="0"/>
-                      <a:ext cx="5334000" cy="1837764"/>
+                      <a:ext cx="5334000" cy="3361210"/>
                     </a:xfrm>
                     <a:prstGeom prst="rect">
                       <a:avLst/>

</xml_diff>